<commit_message>
Replace email password reset with an in-app Teachers screen
</commit_message>
<xml_diff>
--- a/docs/SMS_Diploma_Documentation_Shpak_Maksym.docx
+++ b/docs/SMS_Diploma_Documentation_Shpak_Maksym.docx
@@ -100,7 +100,7 @@
           <w:rFonts w:ascii="Times New Roman" w:hAnsi="Times New Roman"/>
           <w:sz w:val="24"/>
         </w:rPr>
-        <w:t>[Supervisor / Promotor]</w:t>
+        <w:t>Marcin Kacprowicz</w:t>
       </w:r>
     </w:p>
     <w:p>
@@ -219,7 +219,7 @@
                 <w:b w:val="0"/>
                 <w:sz w:val="24"/>
               </w:rPr>
-              <w:t>The project addresses a recurring problem in small and medium educational units: academic records for students, courses, grades and attendance are still often kept in spreadsheets or fragmented paper files. This leads to duplicated data, weak access control, and slow reporting for teachers and administrators. SMS centralises these processes in a single web application with role-based access (Administrator, Teacher, Student), structured CRUD workflows, dashboard analytics, CSV export, and password-reset via email. The system is implemented as a complete engineering deliverable — not only a conceptual design.</w:t>
+              <w:t>The project addresses a recurring problem in small and medium educational units: academic records for students, courses, grades and attendance are still often kept in spreadsheets or fragmented paper files. This leads to duplicated data, weak access control, and slow reporting for teachers and administrators. SMS centralises these processes in a single web application with role-based access (Administrator, Teacher), structured CRUD workflows, dashboard analytics, CSV export. Staff accounts are created by an administrator (there is no public registration). Students are records in the system, not user accounts. The system is implemented as a complete engineering deliverable — not only a conceptual design.</w:t>
             </w:r>
           </w:p>
         </w:tc>
@@ -255,7 +255,7 @@
                 <w:b w:val="0"/>
                 <w:sz w:val="24"/>
               </w:rPr>
-              <w:t>Student Management System is a full-stack Django web application that stores and manages academic data related to students, courses, enrolments, grades and attendance. Administrators maintain the institutional catalogue of students and courses; teachers manage grades and attendance for their own courses; students view personal academic information. The presentation layer uses Django templates with custom CSS and JavaScript; the application layer implements business rules and RBAC; the data layer uses a relational schema (SQLite locally, PostgreSQL in production via DATABASE_URL). The application is production-ready for deployment on platforms such as Render (Gunicorn + WhiteNoise + optional managed Postgres).</w:t>
+              <w:t>Student Management System is a full-stack Django web application that stores and manages academic data related to students, courses, enrolments, grades and attendance. Administrators maintain the institutional catalogue of students and courses; teachers manage grades and attendance for their own courses; students are academic records, not login accounts. The presentation layer uses Django templates with custom CSS and JavaScript; the application layer implements business rules and RBAC; the data layer uses a relational schema (SQLite locally, PostgreSQL in production via DATABASE_URL). The application is live at https://diploma-project-sms-management-system.onrender.com.</w:t>
             </w:r>
           </w:p>
         </w:tc>
@@ -337,7 +337,7 @@
                 <w:b w:val="0"/>
                 <w:sz w:val="24"/>
               </w:rPr>
-              <w:t>Python 3.10+, Django 6, Django Auth (session-based), Gunicorn, WhiteNoise, dj-database-url, PostgreSQL (production) / SQLite (development), SMTP email for password reset</w:t>
+              <w:t>Python 3.12, Django 6, Django Auth (session-based), Gunicorn, WhiteNoise, dj-database-url, PostgreSQL (production) / SQLite (development)</w:t>
             </w:r>
           </w:p>
           <w:p>
@@ -357,7 +357,7 @@
                 <w:b w:val="0"/>
                 <w:sz w:val="24"/>
               </w:rPr>
-              <w:t>Django Templates, HTML5, CSS custom properties, vanilla JavaScript, dashboard JSON endpoint (/api/dashboard/)</w:t>
+              <w:t>Django Templates, HTML5, CSS custom properties, vanilla JavaScript, Chart.js, Turbo, Bootstrap Icons, dashboard JSON endpoint (/api/dashboard/)</w:t>
             </w:r>
           </w:p>
           <w:p>
@@ -377,7 +377,7 @@
                 <w:b w:val="0"/>
                 <w:sz w:val="24"/>
               </w:rPr>
-              <w:t>Render-ready build (build.sh: migrate + collectstatic), environment-based configuration (.env), HTTPS-oriented security settings when DEBUG=False, optional Mailtrap / Gmail SMTP for transactional mail</w:t>
+              <w:t>Render + Neon (build.sh: migrate + collectstatic + seed_demo), English/Polish i18n, HTTPS-oriented security settings when DEBUG=False, live at https://diploma-project-sms-management-system.onrender.com</w:t>
             </w:r>
           </w:p>
         </w:tc>
@@ -413,7 +413,7 @@
                 <w:b w:val="0"/>
                 <w:sz w:val="24"/>
               </w:rPr>
-              <w:t>The stack follows a classic three-tier architecture: Browser (HTML/CSS/JS) → Django views &amp; forms (business logic, authentication, RBAC) → Relational database. Django was selected because it provides batteries-included authentication, CSRF protection, ORM migrations, and an admin site — essential for an academic records system delivered within an engineering diploma timeframe. Session authentication fits server-rendered pages better than JWT (no separate SPA). PostgreSQL is preferred in production for ACID transactions and concurrent multi-user access; SQLite keeps local development simple. WhiteNoise serves compressed static assets behind Gunicorn, which matches typical PaaS deployments without a separate Nginx container. SMTP-based password reset uses Django’s built-in auth views, avoiding custom token plumbing while remaining compatible with Mailtrap sandbox or real providers.</w:t>
+              <w:t>The stack follows a classic three-tier architecture: Browser (HTML/CSS/JS) → Django views &amp; forms (business logic, authentication, RBAC) → Relational database. Django was selected because it provides batteries-included authentication, CSRF protection, ORM migrations, and a dedicated Teachers screen for issuing lecturer accounts — essential for an academic records system delivered within an engineering diploma timeframe. Session authentication fits server-rendered pages better than JWT (no separate SPA). PostgreSQL is preferred in production for ACID transactions and concurrent multi-user access; SQLite keeps local development simple. WhiteNoise serves compressed static assets behind Gunicorn, which matches typical PaaS deployments without a separate Nginx container. There is no public registration: an administrator creates teacher accounts and issues credentials. The Teachers screen inside SMS is used to set a forgotten password, which matches a faculty-office workflow better than self-service email recovery.</w:t>
             </w:r>
           </w:p>
         </w:tc>
@@ -449,7 +449,7 @@
           <w:b w:val="0"/>
           <w:sz w:val="24"/>
         </w:rPr>
-        <w:t>The custom User model extends AbstractUser with a role field (admin / teacher / student). View decorators enforce permissions: administrators manage all records; teachers see only students and grades related to their courses; students are blocked from institutional lists and redirected to their personal dashboard. This prevents privilege escalation while keeping URLs simple.</w:t>
+        <w:t>The custom User model extends AbstractUser with a role field (admin / teacher). View decorators enforce permissions: administrators manage all records; teachers see only students, grades and attendance related to their own courses. A guessed URL outside that scope returns 404. Students are not users — they have no login. This prevents privilege escalation while keeping URLs simple.</w:t>
       </w:r>
     </w:p>
     <w:p>
@@ -504,7 +504,7 @@
           <w:b w:val="0"/>
           <w:sz w:val="24"/>
         </w:rPr>
-        <w:t>The schema comprises six core models: User, Student, Course, Enrollment, Grade, Attendance. Enrolment links students and courses (many-to-many with status). Grade is one-to-one with Enrolment (scale 2.0–5.0 with letter mapping). Attendance is unique per (enrolment, date) to avoid duplicate daily marks. Foreign keys and unique constraints protect referential integrity at the database level.</w:t>
+        <w:t>The schema comprises six core models: User, Student, Course, Enrollment, Grade, Attendance. Enrolment links students and courses (many-to-many with status). A Grade is one weighted component of an enrolment (coursework, midterm, final exam or retake); Enrollment.final_grade is their weighted mean on the 2.0–5.0 scale with letter mapping, and assigned_by records which teacher last saved the mark. Attendance is unique per (enrolment, date). Foreign keys and unique constraints protect referential integrity at the database level.</w:t>
       </w:r>
     </w:p>
     <w:p>
@@ -556,7 +556,7 @@
         <w:rPr>
           <w:rFonts w:ascii="Times New Roman" w:hAnsi="Times New Roman"/>
         </w:rPr>
-        <w:t>2.4 Password Reset via Email</w:t>
+        <w:t>2.4 Staff Account Provisioning</w:t>
       </w:r>
     </w:p>
     <w:p>
@@ -566,7 +566,7 @@
           <w:b w:val="0"/>
           <w:sz w:val="24"/>
         </w:rPr>
-        <w:t>Password recovery uses Django’s auth URLs under /accounts/ with custom email templates. In development, EMAIL_BACKEND=console prints messages to the terminal. In production, SMTP settings (Mailtrap, Gmail, SendGrid, etc.) send a signed reset link. Unknown emails still redirect (no user enumeration), matching Django defaults.</w:t>
+        <w:t>The application has no public registration. An administrator creates teacher accounts (username, role, initial password) on the Teachers screen inside SMS and issues those credentials out of band. Lecturers sign in with the issued username and password; students are data records, not users. If a teacher forgets a password, the administrator sets a new one on that same screen. This matches the real workflow of a faculty office and avoids an email-based recovery flow that would be unused without self-service sign-up.</w:t>
       </w:r>
     </w:p>
     <w:p>
@@ -587,7 +587,28 @@
           <w:b w:val="0"/>
           <w:sz w:val="24"/>
         </w:rPr>
-        <w:t>Configuration is driven by environment variables: SECRET_KEY, DEBUG, ALLOWED_HOSTS, DATABASE_URL, EMAIL_*. When DEBUG=False the application enforces HTTPS redirects, secure cookies, HSTS, and refuses insecure default SECRET_KEY values. WhiteNoise serves hashed/compressed static files. This allows the same codebase to run locally on SQLite and on a hosted PostgreSQL instance without code changes.</w:t>
+        <w:t>Configuration is driven by environment variables: SECRET_KEY, DEBUG, ALLOWED_HOSTS, DATABASE_URL, DJANGO_ADMIN_PASSWORD. When DEBUG=False the application enforces HTTPS redirects, secure cookies, HSTS, and refuses insecure default SECRET_KEY values. DJANGO_ADMIN_PASSWORD replaces the published demo password on the admin account at deploy time, so that password is not left on the public internet. WhiteNoise serves hashed/compressed static files. This allows the same codebase to run locally on SQLite and on a hosted PostgreSQL instance without code changes. The public service is https://diploma-project-sms-management-system.onrender.com. A live demonstration uses the teacher account prof.martinez / demo1234; a second teacher, prof.chen / demo1234, shows that each lecturer sees only their own courses.</w:t>
+      </w:r>
+    </w:p>
+    <w:p>
+      <w:pPr>
+        <w:pStyle w:val="Heading2"/>
+      </w:pPr>
+      <w:r>
+        <w:rPr>
+          <w:rFonts w:ascii="Times New Roman" w:hAnsi="Times New Roman"/>
+        </w:rPr>
+        <w:t>2.6 Internationalisation (English / Polish)</w:t>
+      </w:r>
+    </w:p>
+    <w:p>
+      <w:r>
+        <w:rPr>
+          <w:rFonts w:ascii="Times New Roman" w:hAnsi="Times New Roman"/>
+          <w:b w:val="0"/>
+          <w:sz w:val="24"/>
+        </w:rPr>
+        <w:t>The interface is bilingual. Templates, model choices, flash messages and CSV headers go through Django i18n. The language switch keeps the current page and stores the choice in the session. The compiled Polish catalogue (django.mo) is committed so the deploy image does not depend on gettext. LocalizationTests guard that English and Polish pages actually differ.</w:t>
       </w:r>
     </w:p>
     <w:p>
@@ -608,87 +629,439 @@
           <w:b w:val="0"/>
           <w:sz w:val="24"/>
         </w:rPr>
-        <w:t>This section describes representative screens of the Student Management System. Replace the figure placeholders with actual captures from the running application before the final submission / defence.</w:t>
+        <w:t>The figures below are captures of the running Student Management System (local interface, English locale, light theme unless noted).</w:t>
       </w:r>
     </w:p>
     <w:p>
+      <w:pPr>
+        <w:jc w:val="center"/>
+      </w:pPr>
+      <w:r>
+        <w:drawing>
+          <wp:inline xmlns:a="http://schemas.openxmlformats.org/drawingml/2006/main" xmlns:pic="http://schemas.openxmlformats.org/drawingml/2006/picture">
+            <wp:extent cx="5580000" cy="3487500"/>
+            <wp:docPr id="1" name="Picture 1"/>
+            <wp:cNvGraphicFramePr>
+              <a:graphicFrameLocks noChangeAspect="1"/>
+            </wp:cNvGraphicFramePr>
+            <a:graphic>
+              <a:graphicData uri="http://schemas.openxmlformats.org/drawingml/2006/picture">
+                <pic:pic>
+                  <pic:nvPicPr>
+                    <pic:cNvPr id="0" name="login.png"/>
+                    <pic:cNvPicPr/>
+                  </pic:nvPicPr>
+                  <pic:blipFill>
+                    <a:blip r:embed="rId9"/>
+                    <a:stretch>
+                      <a:fillRect/>
+                    </a:stretch>
+                  </pic:blipFill>
+                  <pic:spPr>
+                    <a:xfrm>
+                      <a:off x="0" y="0"/>
+                      <a:ext cx="5580000" cy="3487500"/>
+                    </a:xfrm>
+                    <a:prstGeom prst="rect"/>
+                  </pic:spPr>
+                </pic:pic>
+              </a:graphicData>
+            </a:graphic>
+          </wp:inline>
+        </w:drawing>
+      </w:r>
+    </w:p>
+    <w:p>
+      <w:pPr>
+        <w:spacing w:after="280"/>
+        <w:jc w:val="center"/>
+      </w:pPr>
       <w:r>
         <w:rPr>
           <w:rFonts w:ascii="Times New Roman" w:hAnsi="Times New Roman"/>
           <w:b w:val="0"/>
-          <w:sz w:val="24"/>
+          <w:i/>
+          <w:sz w:val="20"/>
         </w:rPr>
-        <w:t>Fig. 1 — Login page: username/password form with link to password reset.</w:t>
+        <w:t>Fig. 1 — Login page. Accounts are issued by an administrator; there is no public registration.</w:t>
       </w:r>
     </w:p>
     <w:p>
+      <w:pPr>
+        <w:jc w:val="center"/>
+      </w:pPr>
+      <w:r>
+        <w:drawing>
+          <wp:inline xmlns:a="http://schemas.openxmlformats.org/drawingml/2006/main" xmlns:pic="http://schemas.openxmlformats.org/drawingml/2006/picture">
+            <wp:extent cx="5580000" cy="3487500"/>
+            <wp:docPr id="2" name="Picture 2"/>
+            <wp:cNvGraphicFramePr>
+              <a:graphicFrameLocks noChangeAspect="1"/>
+            </wp:cNvGraphicFramePr>
+            <a:graphic>
+              <a:graphicData uri="http://schemas.openxmlformats.org/drawingml/2006/picture">
+                <pic:pic>
+                  <pic:nvPicPr>
+                    <pic:cNvPr id="0" name="dashboard-light.png"/>
+                    <pic:cNvPicPr/>
+                  </pic:nvPicPr>
+                  <pic:blipFill>
+                    <a:blip r:embed="rId10"/>
+                    <a:stretch>
+                      <a:fillRect/>
+                    </a:stretch>
+                  </pic:blipFill>
+                  <pic:spPr>
+                    <a:xfrm>
+                      <a:off x="0" y="0"/>
+                      <a:ext cx="5580000" cy="3487500"/>
+                    </a:xfrm>
+                    <a:prstGeom prst="rect"/>
+                  </pic:spPr>
+                </pic:pic>
+              </a:graphicData>
+            </a:graphic>
+          </wp:inline>
+        </w:drawing>
+      </w:r>
+    </w:p>
+    <w:p>
+      <w:pPr>
+        <w:spacing w:after="280"/>
+        <w:jc w:val="center"/>
+      </w:pPr>
       <w:r>
         <w:rPr>
           <w:rFonts w:ascii="Times New Roman" w:hAnsi="Times New Roman"/>
           <w:b w:val="0"/>
-          <w:sz w:val="24"/>
+          <w:i/>
+          <w:sz w:val="20"/>
         </w:rPr>
-        <w:t>Fig. 2 — Administrator / Teacher dashboard: KPI cards, grade distribution chart, recent enrolments.</w:t>
+        <w:t>Fig. 2 — Administrator dashboard: KPI tiles and Chart.js analytics.</w:t>
       </w:r>
     </w:p>
     <w:p>
+      <w:pPr>
+        <w:jc w:val="center"/>
+      </w:pPr>
+      <w:r>
+        <w:drawing>
+          <wp:inline xmlns:a="http://schemas.openxmlformats.org/drawingml/2006/main" xmlns:pic="http://schemas.openxmlformats.org/drawingml/2006/picture">
+            <wp:extent cx="5580000" cy="3487500"/>
+            <wp:docPr id="3" name="Picture 3"/>
+            <wp:cNvGraphicFramePr>
+              <a:graphicFrameLocks noChangeAspect="1"/>
+            </wp:cNvGraphicFramePr>
+            <a:graphic>
+              <a:graphicData uri="http://schemas.openxmlformats.org/drawingml/2006/picture">
+                <pic:pic>
+                  <pic:nvPicPr>
+                    <pic:cNvPr id="0" name="students-list.png"/>
+                    <pic:cNvPicPr/>
+                  </pic:nvPicPr>
+                  <pic:blipFill>
+                    <a:blip r:embed="rId11"/>
+                    <a:stretch>
+                      <a:fillRect/>
+                    </a:stretch>
+                  </pic:blipFill>
+                  <pic:spPr>
+                    <a:xfrm>
+                      <a:off x="0" y="0"/>
+                      <a:ext cx="5580000" cy="3487500"/>
+                    </a:xfrm>
+                    <a:prstGeom prst="rect"/>
+                  </pic:spPr>
+                </pic:pic>
+              </a:graphicData>
+            </a:graphic>
+          </wp:inline>
+        </w:drawing>
+      </w:r>
+    </w:p>
+    <w:p>
+      <w:pPr>
+        <w:spacing w:after="280"/>
+        <w:jc w:val="center"/>
+      </w:pPr>
       <w:r>
         <w:rPr>
           <w:rFonts w:ascii="Times New Roman" w:hAnsi="Times New Roman"/>
           <w:b w:val="0"/>
-          <w:sz w:val="24"/>
+          <w:i/>
+          <w:sz w:val="20"/>
         </w:rPr>
-        <w:t>Fig. 3 — Student list with search and filters (program, active status).</w:t>
+        <w:t>Fig. 3 — Student register with search, programme and status filters.</w:t>
       </w:r>
     </w:p>
     <w:p>
+      <w:pPr>
+        <w:jc w:val="center"/>
+      </w:pPr>
+      <w:r>
+        <w:drawing>
+          <wp:inline xmlns:a="http://schemas.openxmlformats.org/drawingml/2006/main" xmlns:pic="http://schemas.openxmlformats.org/drawingml/2006/picture">
+            <wp:extent cx="5580000" cy="3487500"/>
+            <wp:docPr id="4" name="Picture 4"/>
+            <wp:cNvGraphicFramePr>
+              <a:graphicFrameLocks noChangeAspect="1"/>
+            </wp:cNvGraphicFramePr>
+            <a:graphic>
+              <a:graphicData uri="http://schemas.openxmlformats.org/drawingml/2006/picture">
+                <pic:pic>
+                  <pic:nvPicPr>
+                    <pic:cNvPr id="0" name="courses-list.png"/>
+                    <pic:cNvPicPr/>
+                  </pic:nvPicPr>
+                  <pic:blipFill>
+                    <a:blip r:embed="rId12"/>
+                    <a:stretch>
+                      <a:fillRect/>
+                    </a:stretch>
+                  </pic:blipFill>
+                  <pic:spPr>
+                    <a:xfrm>
+                      <a:off x="0" y="0"/>
+                      <a:ext cx="5580000" cy="3487500"/>
+                    </a:xfrm>
+                    <a:prstGeom prst="rect"/>
+                  </pic:spPr>
+                </pic:pic>
+              </a:graphicData>
+            </a:graphic>
+          </wp:inline>
+        </w:drawing>
+      </w:r>
+    </w:p>
+    <w:p>
+      <w:pPr>
+        <w:spacing w:after="280"/>
+        <w:jc w:val="center"/>
+      </w:pPr>
       <w:r>
         <w:rPr>
           <w:rFonts w:ascii="Times New Roman" w:hAnsi="Times New Roman"/>
           <w:b w:val="0"/>
-          <w:sz w:val="24"/>
+          <w:i/>
+          <w:sz w:val="20"/>
         </w:rPr>
-        <w:t>Fig. 4 — Course detail: enrolled students, capacity, teacher assignment.</w:t>
+        <w:t>Fig. 4 — Course catalogue: code, semester, teacher assignment and capacity.</w:t>
       </w:r>
     </w:p>
     <w:p>
+      <w:pPr>
+        <w:jc w:val="center"/>
+      </w:pPr>
+      <w:r>
+        <w:drawing>
+          <wp:inline xmlns:a="http://schemas.openxmlformats.org/drawingml/2006/main" xmlns:pic="http://schemas.openxmlformats.org/drawingml/2006/picture">
+            <wp:extent cx="5580000" cy="3487500"/>
+            <wp:docPr id="5" name="Picture 5"/>
+            <wp:cNvGraphicFramePr>
+              <a:graphicFrameLocks noChangeAspect="1"/>
+            </wp:cNvGraphicFramePr>
+            <a:graphic>
+              <a:graphicData uri="http://schemas.openxmlformats.org/drawingml/2006/picture">
+                <pic:pic>
+                  <pic:nvPicPr>
+                    <pic:cNvPr id="0" name="grades-list.png"/>
+                    <pic:cNvPicPr/>
+                  </pic:nvPicPr>
+                  <pic:blipFill>
+                    <a:blip r:embed="rId13"/>
+                    <a:stretch>
+                      <a:fillRect/>
+                    </a:stretch>
+                  </pic:blipFill>
+                  <pic:spPr>
+                    <a:xfrm>
+                      <a:off x="0" y="0"/>
+                      <a:ext cx="5580000" cy="3487500"/>
+                    </a:xfrm>
+                    <a:prstGeom prst="rect"/>
+                  </pic:spPr>
+                </pic:pic>
+              </a:graphicData>
+            </a:graphic>
+          </wp:inline>
+        </w:drawing>
+      </w:r>
+    </w:p>
+    <w:p>
+      <w:pPr>
+        <w:spacing w:after="280"/>
+        <w:jc w:val="center"/>
+      </w:pPr>
       <w:r>
         <w:rPr>
           <w:rFonts w:ascii="Times New Roman" w:hAnsi="Times New Roman"/>
           <w:b w:val="0"/>
-          <w:sz w:val="24"/>
+          <w:i/>
+          <w:sz w:val="20"/>
         </w:rPr>
-        <w:t>Fig. 5 — Grade entry form with validation (2.0–5.0) and comments.</w:t>
+        <w:t>Fig. 5 — Grade register: weighted components, letter bands and the teacher who saved the mark.</w:t>
       </w:r>
     </w:p>
     <w:p>
+      <w:pPr>
+        <w:jc w:val="center"/>
+      </w:pPr>
+      <w:r>
+        <w:drawing>
+          <wp:inline xmlns:a="http://schemas.openxmlformats.org/drawingml/2006/main" xmlns:pic="http://schemas.openxmlformats.org/drawingml/2006/picture">
+            <wp:extent cx="5580000" cy="3487500"/>
+            <wp:docPr id="6" name="Picture 6"/>
+            <wp:cNvGraphicFramePr>
+              <a:graphicFrameLocks noChangeAspect="1"/>
+            </wp:cNvGraphicFramePr>
+            <a:graphic>
+              <a:graphicData uri="http://schemas.openxmlformats.org/drawingml/2006/picture">
+                <pic:pic>
+                  <pic:nvPicPr>
+                    <pic:cNvPr id="0" name="attendance-list.png"/>
+                    <pic:cNvPicPr/>
+                  </pic:nvPicPr>
+                  <pic:blipFill>
+                    <a:blip r:embed="rId14"/>
+                    <a:stretch>
+                      <a:fillRect/>
+                    </a:stretch>
+                  </pic:blipFill>
+                  <pic:spPr>
+                    <a:xfrm>
+                      <a:off x="0" y="0"/>
+                      <a:ext cx="5580000" cy="3487500"/>
+                    </a:xfrm>
+                    <a:prstGeom prst="rect"/>
+                  </pic:spPr>
+                </pic:pic>
+              </a:graphicData>
+            </a:graphic>
+          </wp:inline>
+        </w:drawing>
+      </w:r>
+    </w:p>
+    <w:p>
+      <w:pPr>
+        <w:spacing w:after="280"/>
+        <w:jc w:val="center"/>
+      </w:pPr>
       <w:r>
         <w:rPr>
           <w:rFonts w:ascii="Times New Roman" w:hAnsi="Times New Roman"/>
           <w:b w:val="0"/>
-          <w:sz w:val="24"/>
+          <w:i/>
+          <w:sz w:val="20"/>
         </w:rPr>
         <w:t>Fig. 6 — Attendance register with present / absent / late statuses.</w:t>
       </w:r>
     </w:p>
     <w:p>
+      <w:pPr>
+        <w:jc w:val="center"/>
+      </w:pPr>
+      <w:r>
+        <w:drawing>
+          <wp:inline xmlns:a="http://schemas.openxmlformats.org/drawingml/2006/main" xmlns:pic="http://schemas.openxmlformats.org/drawingml/2006/picture">
+            <wp:extent cx="5580000" cy="3487500"/>
+            <wp:docPr id="7" name="Picture 7"/>
+            <wp:cNvGraphicFramePr>
+              <a:graphicFrameLocks noChangeAspect="1"/>
+            </wp:cNvGraphicFramePr>
+            <a:graphic>
+              <a:graphicData uri="http://schemas.openxmlformats.org/drawingml/2006/picture">
+                <pic:pic>
+                  <pic:nvPicPr>
+                    <pic:cNvPr id="0" name="teachers-list.png"/>
+                    <pic:cNvPicPr/>
+                  </pic:nvPicPr>
+                  <pic:blipFill>
+                    <a:blip r:embed="rId15"/>
+                    <a:stretch>
+                      <a:fillRect/>
+                    </a:stretch>
+                  </pic:blipFill>
+                  <pic:spPr>
+                    <a:xfrm>
+                      <a:off x="0" y="0"/>
+                      <a:ext cx="5580000" cy="3487500"/>
+                    </a:xfrm>
+                    <a:prstGeom prst="rect"/>
+                  </pic:spPr>
+                </pic:pic>
+              </a:graphicData>
+            </a:graphic>
+          </wp:inline>
+        </w:drawing>
+      </w:r>
+    </w:p>
+    <w:p>
+      <w:pPr>
+        <w:spacing w:after="280"/>
+        <w:jc w:val="center"/>
+      </w:pPr>
       <w:r>
         <w:rPr>
           <w:rFonts w:ascii="Times New Roman" w:hAnsi="Times New Roman"/>
           <w:b w:val="0"/>
-          <w:sz w:val="24"/>
+          <w:i/>
+          <w:sz w:val="20"/>
         </w:rPr>
-        <w:t>Fig. 7 — Password reset email (console or SMTP) containing the secure confirmation link.</w:t>
+        <w:t>Fig. 7 — Teachers screen: the administrator issues lecturer accounts and can set a new password.</w:t>
       </w:r>
     </w:p>
     <w:p>
+      <w:pPr>
+        <w:jc w:val="center"/>
+      </w:pPr>
+      <w:r>
+        <w:drawing>
+          <wp:inline xmlns:a="http://schemas.openxmlformats.org/drawingml/2006/main" xmlns:pic="http://schemas.openxmlformats.org/drawingml/2006/picture">
+            <wp:extent cx="5580000" cy="3487500"/>
+            <wp:docPr id="8" name="Picture 8"/>
+            <wp:cNvGraphicFramePr>
+              <a:graphicFrameLocks noChangeAspect="1"/>
+            </wp:cNvGraphicFramePr>
+            <a:graphic>
+              <a:graphicData uri="http://schemas.openxmlformats.org/drawingml/2006/picture">
+                <pic:pic>
+                  <pic:nvPicPr>
+                    <pic:cNvPr id="0" name="student-detail.png"/>
+                    <pic:cNvPicPr/>
+                  </pic:nvPicPr>
+                  <pic:blipFill>
+                    <a:blip r:embed="rId16"/>
+                    <a:stretch>
+                      <a:fillRect/>
+                    </a:stretch>
+                  </pic:blipFill>
+                  <pic:spPr>
+                    <a:xfrm>
+                      <a:off x="0" y="0"/>
+                      <a:ext cx="5580000" cy="3487500"/>
+                    </a:xfrm>
+                    <a:prstGeom prst="rect"/>
+                  </pic:spPr>
+                </pic:pic>
+              </a:graphicData>
+            </a:graphic>
+          </wp:inline>
+        </w:drawing>
+      </w:r>
+    </w:p>
+    <w:p>
+      <w:pPr>
+        <w:spacing w:after="280"/>
+        <w:jc w:val="center"/>
+      </w:pPr>
       <w:r>
         <w:rPr>
           <w:rFonts w:ascii="Times New Roman" w:hAnsi="Times New Roman"/>
           <w:b w:val="0"/>
-          <w:sz w:val="24"/>
+          <w:i/>
+          <w:sz w:val="20"/>
         </w:rPr>
-        <w:t>Fig. 8 — JSON response from GET /api/dashboard/ (browser or HTTP client).</w:t>
+        <w:t>Fig. 8 — Student profile: enrolments, grades and attendance in one view.</w:t>
       </w:r>
     </w:p>
     <w:p>
@@ -709,7 +1082,7 @@
           <w:b w:val="0"/>
           <w:sz w:val="24"/>
         </w:rPr>
-        <w:t>The primary goal — to design and implement a functional web-based Student Management System for educational administration — was achieved. The application covers authentication with RBAC, student and course administration, enrolments, grading, attendance, analytics dashboard, CSV export, password reset mail, and production-oriented configuration.</w:t>
+        <w:t>The primary goal — to design and implement a functional web-based Student Management System for educational administration — was achieved. The application covers authentication with RBAC, student and course administration, enrolments, weighted grade components, bulk attendance marking, a bilingual EN/PL interface, analytics dashboard, CSV export, and production-oriented configuration.</w:t>
       </w:r>
     </w:p>
     <w:p>
@@ -727,7 +1100,7 @@
         <w:pStyle w:val="ListBullet"/>
       </w:pPr>
       <w:r>
-        <w:t>Role-based access for Administrator, Teacher and Student</w:t>
+        <w:t>Role-based access for Administrator and Teacher (students are records, not users)</w:t>
       </w:r>
     </w:p>
     <w:p>
@@ -751,6 +1124,14 @@
         <w:pStyle w:val="ListBullet"/>
       </w:pPr>
       <w:r>
+        <w:t>Weighted grade components, authorship audit, bulk class attendance</w:t>
+      </w:r>
+    </w:p>
+    <w:p>
+      <w:pPr>
+        <w:pStyle w:val="ListBullet"/>
+      </w:pPr>
+      <w:r>
         <w:t>Dashboard KPIs and role-scoped REST endpoint /api/dashboard/</w:t>
       </w:r>
     </w:p>
@@ -759,7 +1140,7 @@
         <w:pStyle w:val="ListBullet"/>
       </w:pPr>
       <w:r>
-        <w:t>Email-based password reset (console locally, SMTP in production)</w:t>
+        <w:t>Bilingual interface (English / Polish, 308 translatable strings)</w:t>
       </w:r>
     </w:p>
     <w:p>
@@ -767,7 +1148,15 @@
         <w:pStyle w:val="ListBullet"/>
       </w:pPr>
       <w:r>
-        <w:t>Automated test suite covering models, auth, API, CRUD and mail</w:t>
+        <w:t>Staff accounts provisioned by an administrator (no public registration)</w:t>
+      </w:r>
+    </w:p>
+    <w:p>
+      <w:pPr>
+        <w:pStyle w:val="ListBullet"/>
+      </w:pPr>
+      <w:r>
+        <w:t>Automated test suite covering models, auth, API and CRUD</w:t>
       </w:r>
     </w:p>
     <w:p>
@@ -803,7 +1192,7 @@
         <w:pStyle w:val="ListBullet"/>
       </w:pPr>
       <w:r>
-        <w:t>Multi-language UI (EN/PL) using Django i18n</w:t>
+        <w:t>Student portal — a third role with read-only access to own results</w:t>
       </w:r>
     </w:p>
     <w:p>
@@ -819,7 +1208,7 @@
         <w:pStyle w:val="ListBullet"/>
       </w:pPr>
       <w:r>
-        <w:t>Calendar view for classes and attendance sessions</w:t>
+        <w:t>Email notifications on new grades and absences</w:t>
       </w:r>
     </w:p>
     <w:p>
@@ -827,7 +1216,7 @@
         <w:pStyle w:val="ListBullet"/>
       </w:pPr>
       <w:r>
-        <w:t>REST API tokens for mobile clients</w:t>
+        <w:t>Documented REST API with token authentication for mobile clients</w:t>
       </w:r>
     </w:p>
     <w:p>
@@ -835,7 +1224,7 @@
         <w:pStyle w:val="ListBullet"/>
       </w:pPr>
       <w:r>
-        <w:t>LDAP / Google SSO for institutional login</w:t>
+        <w:t>Two-factor login (TOTP) for administrator accounts</w:t>
       </w:r>
     </w:p>
     <w:p>
@@ -843,7 +1232,7 @@
         <w:pStyle w:val="ListBullet"/>
       </w:pPr>
       <w:r>
-        <w:t>Soft-delete audit log for grade changes</w:t>
+        <w:t>Timetabling with room and slot conflict detection</w:t>
       </w:r>
     </w:p>
     <w:p>
@@ -984,7 +1373,7 @@
           <w:b w:val="0"/>
           <w:sz w:val="24"/>
         </w:rPr>
-        <w:t>[12] Django Software Foundation — Sending email — https://docs.djangoproject.com/en/stable/topics/email/</w:t>
+        <w:t>[12] Bootstrap Icons — https://icons.getbootstrap.com</w:t>
       </w:r>
     </w:p>
     <w:p>
@@ -994,27 +1383,7 @@
           <w:b w:val="0"/>
           <w:sz w:val="24"/>
         </w:rPr>
-        <w:t>[13] Mailtrap — Email Testing for Developers — https://mailtrap.io</w:t>
-      </w:r>
-    </w:p>
-    <w:p>
-      <w:r>
-        <w:rPr>
-          <w:rFonts w:ascii="Times New Roman" w:hAnsi="Times New Roman"/>
-          <w:b w:val="0"/>
-          <w:sz w:val="24"/>
-        </w:rPr>
-        <w:t>[14] Bootstrap Icons — https://icons.getbootstrap.com</w:t>
-      </w:r>
-    </w:p>
-    <w:p>
-      <w:r>
-        <w:rPr>
-          <w:rFonts w:ascii="Times New Roman" w:hAnsi="Times New Roman"/>
-          <w:b w:val="0"/>
-          <w:sz w:val="24"/>
-        </w:rPr>
-        <w:t>[15] Uniwersytet VIZJA / AEH — study programme materials for Computer Science (engineering profile)</w:t>
+        <w:t>[13] Uniwersytet VIZJA / AEH — study programme materials for Computer Science (engineering profile)</w:t>
       </w:r>
     </w:p>
     <w:sectPr>

</xml_diff>

<commit_message>
Point diploma docs at the live thesms.me URL.
</commit_message>
<xml_diff>
--- a/docs/SMS_Diploma_Documentation_Shpak_Maksym.docx
+++ b/docs/SMS_Diploma_Documentation_Shpak_Maksym.docx
@@ -255,7 +255,7 @@
                 <w:b w:val="0"/>
                 <w:sz w:val="24"/>
               </w:rPr>
-              <w:t>Student Management System is a full-stack Django web application that stores and manages academic data related to students, courses, enrolments, grades and attendance. Administrators maintain the institutional catalogue of students and courses; teachers manage grades and attendance for their own courses; students are academic records, not login accounts. The presentation layer uses Django templates with custom CSS and JavaScript; the application layer implements business rules and RBAC; the data layer uses a relational schema (SQLite locally, PostgreSQL in production via DATABASE_URL). The application is live at https://diploma-project-sms-management-system.onrender.com.</w:t>
+              <w:t>Student Management System is a full-stack Django web application that stores and manages academic data related to students, courses, enrolments, grades and attendance. Administrators maintain the institutional catalogue of students and courses; teachers manage grades and attendance for their own courses; students are academic records, not login accounts. The presentation layer uses Django templates with custom CSS and JavaScript; the application layer implements business rules and RBAC; the data layer uses a relational schema (SQLite locally, PostgreSQL in production via DATABASE_URL). The application is live at https://thesms.me (Render backup: https://diploma-project-sms-management-system.onrender.com).</w:t>
             </w:r>
           </w:p>
         </w:tc>
@@ -377,7 +377,7 @@
                 <w:b w:val="0"/>
                 <w:sz w:val="24"/>
               </w:rPr>
-              <w:t>Render + Neon (build.sh: migrate + collectstatic + seed_demo), English/Polish i18n, HTTPS-oriented security settings when DEBUG=False, live at https://diploma-project-sms-management-system.onrender.com</w:t>
+              <w:t>Render + Neon (build.sh: migrate + collectstatic + seed_demo), English/Polish i18n, HTTPS-oriented security settings when DEBUG=False, live at https://thesms.me (Render backup: https://diploma-project-sms-management-system.onrender.com)</w:t>
             </w:r>
           </w:p>
         </w:tc>
@@ -587,7 +587,7 @@
           <w:b w:val="0"/>
           <w:sz w:val="24"/>
         </w:rPr>
-        <w:t>Configuration is driven by environment variables: SECRET_KEY, DEBUG, ALLOWED_HOSTS, DATABASE_URL, DJANGO_ADMIN_PASSWORD. When DEBUG=False the application enforces HTTPS redirects, secure cookies, HSTS, and refuses insecure default SECRET_KEY values. DJANGO_ADMIN_PASSWORD replaces the published demo password on the admin account at deploy time, so that password is not left on the public internet. WhiteNoise serves hashed/compressed static files. This allows the same codebase to run locally on SQLite and on a hosted PostgreSQL instance without code changes. The public service is https://diploma-project-sms-management-system.onrender.com. A live demonstration uses the teacher account prof.martinez / demo1234; a second teacher, prof.chen / demo1234, shows that each lecturer sees only their own courses.</w:t>
+        <w:t>Configuration is driven by environment variables: SECRET_KEY, DEBUG, ALLOWED_HOSTS, DATABASE_URL, DJANGO_ADMIN_PASSWORD. When DEBUG=False the application enforces HTTPS redirects, secure cookies, HSTS, and refuses insecure default SECRET_KEY values. DJANGO_ADMIN_PASSWORD replaces the published demo password on the admin account at deploy time, so that password is not left on the public internet. WhiteNoise serves hashed/compressed static files. This allows the same codebase to run locally on SQLite and on a hosted PostgreSQL instance without code changes. The public service is https://thesms.me (Render backup: https://diploma-project-sms-management-system.onrender.com). A live demonstration uses the teacher account prof.martinez / demo1234; a second teacher, prof.chen / demo1234, shows that each lecturer sees only their own courses.</w:t>
       </w:r>
     </w:p>
     <w:p>

</xml_diff>

<commit_message>
Rebuild the submitted documentation from the corrected source
</commit_message>
<xml_diff>
--- a/docs/SMS_Diploma_Documentation_Shpak_Maksym.docx
+++ b/docs/SMS_Diploma_Documentation_Shpak_Maksym.docx
@@ -525,7 +525,7 @@
           <w:b w:val="0"/>
           <w:sz w:val="24"/>
         </w:rPr>
-        <w:t>The HTML dashboard aggregates KPIs (students, courses, enrolments, average grade) and chart series (grade distribution, enrolments per course). Endpoint GET /api/dashboard/ returns the same metrics as JSON, scoped by role, so charts or future SPA clients can refresh data without reloading the page.</w:t>
+        <w:t>The HTML dashboard aggregates KPIs (students, courses, enrolments, average grade) and chart series (grade distribution, enrolments per course). The page itself is server-rendered: both the tiles and the chart series arrive in the HTML, so no request is needed before the dashboard is readable. Endpoint GET /api/dashboard/ exposes the same figures as JSON for external clients. Both call one function, dashboard_metrics(), which applies the role scoping, so the two views of the data cannot drift apart.</w:t>
       </w:r>
     </w:p>
     <w:p>
@@ -608,7 +608,7 @@
           <w:b w:val="0"/>
           <w:sz w:val="24"/>
         </w:rPr>
-        <w:t>The interface is bilingual. Templates, model choices, flash messages and CSV headers go through Django i18n. The language switch keeps the current page and stores the choice in the session. The compiled Polish catalogue (django.mo) is committed so the deploy image does not depend on gettext. LocalizationTests guard that English and Polish pages actually differ.</w:t>
+        <w:t>The interface is bilingual. Templates, model choices, flash messages and CSV headers go through Django i18n. The language switch keeps the current page and stores the choice in the django_language cookie, which LocaleMiddleware reads on every request. The compiled Polish catalogue (django.mo) is committed so the deploy image does not depend on gettext. LocalizationTests guard that English and Polish pages actually differ, and TranslationCatalogueTests fail on any fuzzy or untranslated entry, because msgfmt drops fuzzy messages and they would ship as English.</w:t>
       </w:r>
     </w:p>
     <w:p>
@@ -1140,7 +1140,7 @@
         <w:pStyle w:val="ListBullet"/>
       </w:pPr>
       <w:r>
-        <w:t>Bilingual interface (English / Polish, 308 translatable strings)</w:t>
+        <w:t>Bilingual interface (English / Polish, 312 translatable strings)</w:t>
       </w:r>
     </w:p>
     <w:p>
@@ -1156,7 +1156,7 @@
         <w:pStyle w:val="ListBullet"/>
       </w:pPr>
       <w:r>
-        <w:t>Automated test suite (80 tests) covering models, auth, API and CRUD</w:t>
+        <w:t>Automated test suite (96 tests) covering models, auth, API and CRUD</w:t>
       </w:r>
     </w:p>
     <w:p>

</xml_diff>

<commit_message>
Give bulk attendance marking the space it earns
</commit_message>
<xml_diff>
--- a/docs/SMS_Diploma_Documentation_Shpak_Maksym.docx
+++ b/docs/SMS_Diploma_Documentation_Shpak_Maksym.docx
@@ -609,6 +609,37 @@
           <w:sz w:val="24"/>
         </w:rPr>
         <w:t>The interface is bilingual. Templates, model choices, flash messages and CSV headers go through Django i18n. The language switch keeps the current page and stores the choice in the django_language cookie, which LocaleMiddleware reads on every request. The compiled Polish catalogue (django.mo) is committed so the deploy image does not depend on gettext. LocalizationTests guard that English and Polish pages actually differ, and TranslationCatalogueTests fail on any fuzzy or untranslated entry, because msgfmt drops fuzzy messages and they would ship as English.</w:t>
+      </w:r>
+    </w:p>
+    <w:p>
+      <w:pPr>
+        <w:pStyle w:val="Heading2"/>
+      </w:pPr>
+      <w:r>
+        <w:rPr>
+          <w:rFonts w:ascii="Times New Roman" w:hAnsi="Times New Roman"/>
+        </w:rPr>
+        <w:t>2.7 Bulk Attendance Marking</w:t>
+      </w:r>
+    </w:p>
+    <w:p>
+      <w:r>
+        <w:rPr>
+          <w:rFonts w:ascii="Times New Roman" w:hAnsi="Times New Roman"/>
+          <w:b w:val="0"/>
+          <w:sz w:val="24"/>
+        </w:rPr>
+        <w:t>Attendance is the highest-volume operation in the system: a lecturer records a status for every student in a group after every class. Marking students one at a time would mean a separate form submission per student, so the Mark Class screen loads the whole roster for a chosen course and date and saves it in a single POST. Quick actions set the entire group to present, absent or late before individual corrections. The view iterates the submitted statuses and uses update_or_create per enrolment, so re-marking the same class corrects the existing rows instead of duplicating them. "Not marked" is treated as a deliberate state rather than a missing one: choosing it removes the stored record, so the screen keeps telling the truth about that date.</w:t>
+      </w:r>
+    </w:p>
+    <w:p>
+      <w:r>
+        <w:rPr>
+          <w:rFonts w:ascii="Times New Roman" w:hAnsi="Times New Roman"/>
+          <w:b w:val="0"/>
+          <w:sz w:val="24"/>
+        </w:rPr>
+        <w:t>Correctness does not rest on the interface. Attendance carries a unique constraint on (enrollment, date) in the schema, so a second record for the same student on the same day cannot be created by any path — the bulk screen, the single-record form, the Django admin or a direct SQL insert. A teacher may only load rosters for courses they teach, enforced by the same queryset scoping as the rest of the application. BulkAttendanceTests cover the group save, a repeated save against the unique rule, clearing a record, the pre-selected roster, active enrolments only, an unparsable date falling back to today, and a teacher trying to read or mark a colleague's course.</w:t>
       </w:r>
     </w:p>
     <w:p>

</xml_diff>

<commit_message>
Cite the compared platforms and stop claiming someone else's backups
</commit_message>
<xml_diff>
--- a/docs/SMS_Diploma_Documentation_Shpak_Maksym.docx
+++ b/docs/SMS_Diploma_Documentation_Shpak_Maksym.docx
@@ -1417,6 +1417,55 @@
         <w:t>[13] Uniwersytet VIZJA / AEH — study programme materials for Computer Science (engineering profile)</w:t>
       </w:r>
     </w:p>
+    <w:p>
+      <w:r>
+        <w:rPr>
+          <w:rFonts w:ascii="Times New Roman" w:hAnsi="Times New Roman"/>
+          <w:b w:val="0"/>
+          <w:sz w:val="24"/>
+        </w:rPr>
+      </w:r>
+    </w:p>
+    <w:p>
+      <w:r>
+        <w:rPr>
+          <w:rFonts w:ascii="Times New Roman" w:hAnsi="Times New Roman"/>
+          <w:b w:val="0"/>
+          <w:sz w:val="24"/>
+        </w:rPr>
+        <w:t>Platforms compared in section 1</w:t>
+      </w:r>
+    </w:p>
+    <w:p>
+      <w:r>
+        <w:rPr>
+          <w:rFonts w:ascii="Times New Roman" w:hAnsi="Times New Roman"/>
+          <w:b w:val="0"/>
+          <w:sz w:val="24"/>
+        </w:rPr>
+        <w:t>[14] Moodle — Moodle Docs (attendance is the contributed mod_attendance plugin) — https://docs.moodle.org</w:t>
+      </w:r>
+    </w:p>
+    <w:p>
+      <w:r>
+        <w:rPr>
+          <w:rFonts w:ascii="Times New Roman" w:hAnsi="Times New Roman"/>
+          <w:b w:val="0"/>
+          <w:sz w:val="24"/>
+        </w:rPr>
+        <w:t>[15] MUCI — USOS, the university study service system used by Polish public HEIs — https://www.usos.edu.pl</w:t>
+      </w:r>
+    </w:p>
+    <w:p>
+      <w:r>
+        <w:rPr>
+          <w:rFonts w:ascii="Times New Roman" w:hAnsi="Times New Roman"/>
+          <w:b w:val="0"/>
+          <w:sz w:val="24"/>
+        </w:rPr>
+        <w:t>[16] Google — Classroom Help Centre — https://support.google.com/edu/classroom</w:t>
+      </w:r>
+    </w:p>
     <w:sectPr>
       <w:pgSz w:w="12240" w:h="15840"/>
       <w:pgMar w:top="1134" w:right="850" w:bottom="1134" w:left="1417" w:header="720" w:footer="720" w:gutter="0"/>

</xml_diff>